<commit_message>
Document Render deployment and hosted URL
</commit_message>
<xml_diff>
--- a/docs/Software_Requirements_Specification.docx
+++ b/docs/Software_Requirements_Specification.docx
@@ -36,7 +36,7 @@
     </w:p>
     <w:p>
       <w:r>
-        <w:t>Hosted application URL: To be supplied after deployment</w:t>
+        <w:t>Hosted application URL: https://capstone-project-554w.onrender.com</w:t>
       </w:r>
     </w:p>
     <w:p>
@@ -305,7 +305,7 @@
         <w:pStyle w:val="ListBullet"/>
       </w:pPr>
       <w:r>
-        <w:t>The exact hosting providers and public URLs will be selected during deployment.</w:t>
+        <w:t>The production web service is hosted on Render and the production database is hosted on MongoDB Atlas. The live application is available at https://capstone-project-554w.onrender.com.</w:t>
       </w:r>
     </w:p>
     <w:p>
@@ -2989,7 +2989,7 @@
     </w:p>
     <w:p>
       <w:r>
-        <w:t>The production release consists of a hosted React client, a reachable Express API, and a managed MongoDB database. Configure production environment variables in the hosting provider, update API base URL and CORS origin, enable HTTPS, configure single-page-app deep-link fallback, and inspect provider logs after deployment.</w:t>
+        <w:t>The production release is deployed as one Render web service. Express serves the built React client and the versioned API from the same HTTPS origin, while MongoDB Atlas stores account and task data. Configure MONGODB_URI, JWT_SECRET, and NODE_ENV=production as service environment variables; Render supplies PORT. Atlas Network Access must include the Render service outbound ranges. The live app is https://capstone-project-554w.onrender.com. Verify registration, authentication, task actions, and refresh behavior on the hosted app.</w:t>
       </w:r>
     </w:p>
     <w:tbl>
@@ -3110,7 +3110,7 @@
           </w:tcPr>
           <w:p>
             <w:r>
-              <w:t>Not deployed yet. Add the working HTTPS URL after deploying and completing post-deployment checks.</w:t>
+              <w:t>Live URL: https://capstone-project-554w.onrender.com. The sign-in page has been confirmed to load; complete authenticated workflow checks.</w:t>
             </w:r>
           </w:p>
         </w:tc>
@@ -3134,7 +3134,7 @@
           </w:tcPr>
           <w:p>
             <w:r>
-              <w:t>To be recorded after deployment.</w:t>
+              <w:t>https://capstone-project-554w.onrender.com/api/v1 (same-origin API).</w:t>
             </w:r>
           </w:p>
         </w:tc>
@@ -3158,7 +3158,7 @@
           </w:tcPr>
           <w:p>
             <w:r>
-              <w:t>Add desktop and mobile screenshots of key screens to the repository or submission.</w:t>
+              <w:t>Add screenshots of the sign-in page, populated task dashboard, and task form to the repository or submission after authenticated UI capture.</w:t>
             </w:r>
           </w:p>
         </w:tc>

</xml_diff>